<commit_message>
feat(qa): require clean difficulty values before export
</commit_message>
<xml_diff>
--- a/data/Vorlagen/AUFGABEN_MUSTER_STANDARD.docx
+++ b/data/Vorlagen/AUFGABEN_MUSTER_STANDARD.docx
@@ -225,6 +225,28 @@
           </w:p>
         </w:tc>
       </w:tr>
+      <w:tr>
+        <w:tc>
+          <w:tcPr>
+            <w:tcW w:type="dxa" w:w="4320"/>
+          </w:tcPr>
+          <w:p>
+            <w:r>
+              <w:t>Kategorie</w:t>
+            </w:r>
+          </w:p>
+        </w:tc>
+        <w:tc>
+          <w:tcPr>
+            <w:tcW w:type="dxa" w:w="4320"/>
+          </w:tcPr>
+          <w:p>
+            <w:r>
+              <w:t>Musteraufgabe</w:t>
+            </w:r>
+          </w:p>
+        </w:tc>
+      </w:tr>
     </w:tbl>
     <w:p/>
     <w:p>
@@ -403,6 +425,28 @@
           </w:tcPr>
           <w:p>
             <w:r/>
+          </w:p>
+        </w:tc>
+      </w:tr>
+      <w:tr>
+        <w:tc>
+          <w:tcPr>
+            <w:tcW w:type="dxa" w:w="4320"/>
+          </w:tcPr>
+          <w:p>
+            <w:r>
+              <w:t>Kategorie</w:t>
+            </w:r>
+          </w:p>
+        </w:tc>
+        <w:tc>
+          <w:tcPr>
+            <w:tcW w:type="dxa" w:w="4320"/>
+          </w:tcPr>
+          <w:p>
+            <w:r>
+              <w:t>Musteraufgabe</w:t>
+            </w:r>
           </w:p>
         </w:tc>
       </w:tr>
@@ -587,6 +631,28 @@
           </w:p>
         </w:tc>
       </w:tr>
+      <w:tr>
+        <w:tc>
+          <w:tcPr>
+            <w:tcW w:type="dxa" w:w="4320"/>
+          </w:tcPr>
+          <w:p>
+            <w:r>
+              <w:t>Kategorie</w:t>
+            </w:r>
+          </w:p>
+        </w:tc>
+        <w:tc>
+          <w:tcPr>
+            <w:tcW w:type="dxa" w:w="4320"/>
+          </w:tcPr>
+          <w:p>
+            <w:r>
+              <w:t>Musteraufgabe</w:t>
+            </w:r>
+          </w:p>
+        </w:tc>
+      </w:tr>
     </w:tbl>
     <w:p/>
     <w:p>
@@ -768,6 +834,28 @@
           </w:p>
         </w:tc>
       </w:tr>
+      <w:tr>
+        <w:tc>
+          <w:tcPr>
+            <w:tcW w:type="dxa" w:w="4320"/>
+          </w:tcPr>
+          <w:p>
+            <w:r>
+              <w:t>Kategorie</w:t>
+            </w:r>
+          </w:p>
+        </w:tc>
+        <w:tc>
+          <w:tcPr>
+            <w:tcW w:type="dxa" w:w="4320"/>
+          </w:tcPr>
+          <w:p>
+            <w:r>
+              <w:t>Musteraufgabe</w:t>
+            </w:r>
+          </w:p>
+        </w:tc>
+      </w:tr>
     </w:tbl>
     <w:p/>
     <w:p>
@@ -946,6 +1034,28 @@
           </w:tcPr>
           <w:p>
             <w:r/>
+          </w:p>
+        </w:tc>
+      </w:tr>
+      <w:tr>
+        <w:tc>
+          <w:tcPr>
+            <w:tcW w:type="dxa" w:w="4320"/>
+          </w:tcPr>
+          <w:p>
+            <w:r>
+              <w:t>Kategorie</w:t>
+            </w:r>
+          </w:p>
+        </w:tc>
+        <w:tc>
+          <w:tcPr>
+            <w:tcW w:type="dxa" w:w="4320"/>
+          </w:tcPr>
+          <w:p>
+            <w:r>
+              <w:t>Musteraufgabe</w:t>
+            </w:r>
           </w:p>
         </w:tc>
       </w:tr>

</xml_diff>

<commit_message>
docs(template): add title field to task tables
</commit_message>
<xml_diff>
--- a/data/Vorlagen/AUFGABEN_MUSTER_STANDARD.docx
+++ b/data/Vorlagen/AUFGABEN_MUSTER_STANDARD.docx
@@ -80,6 +80,26 @@
             <w:r>
               <w:t>A-001</w:t>
             </w:r>
+          </w:p>
+        </w:tc>
+      </w:tr>
+      <w:tr>
+        <w:tc>
+          <w:tcPr>
+            <w:tcW w:type="dxa" w:w="4320"/>
+          </w:tcPr>
+          <w:p>
+            <w:r>
+              <w:t>Titel</w:t>
+            </w:r>
+          </w:p>
+        </w:tc>
+        <w:tc>
+          <w:tcPr>
+            <w:tcW w:type="dxa" w:w="4320"/>
+          </w:tcPr>
+          <w:p>
+            <w:r/>
           </w:p>
         </w:tc>
       </w:tr>
@@ -293,6 +313,26 @@
           </w:tcPr>
           <w:p>
             <w:r>
+              <w:t>Titel</w:t>
+            </w:r>
+          </w:p>
+        </w:tc>
+        <w:tc>
+          <w:tcPr>
+            <w:tcW w:type="dxa" w:w="4320"/>
+          </w:tcPr>
+          <w:p>
+            <w:r/>
+          </w:p>
+        </w:tc>
+      </w:tr>
+      <w:tr>
+        <w:tc>
+          <w:tcPr>
+            <w:tcW w:type="dxa" w:w="4320"/>
+          </w:tcPr>
+          <w:p>
+            <w:r>
               <w:t>Intro/Einleitung (optional)</w:t>
             </w:r>
           </w:p>
@@ -486,6 +526,26 @@
             <w:r>
               <w:t>A-003</w:t>
             </w:r>
+          </w:p>
+        </w:tc>
+      </w:tr>
+      <w:tr>
+        <w:tc>
+          <w:tcPr>
+            <w:tcW w:type="dxa" w:w="4320"/>
+          </w:tcPr>
+          <w:p>
+            <w:r>
+              <w:t>Titel</w:t>
+            </w:r>
+          </w:p>
+        </w:tc>
+        <w:tc>
+          <w:tcPr>
+            <w:tcW w:type="dxa" w:w="4320"/>
+          </w:tcPr>
+          <w:p>
+            <w:r/>
           </w:p>
         </w:tc>
       </w:tr>
@@ -699,6 +759,26 @@
           </w:tcPr>
           <w:p>
             <w:r>
+              <w:t>Titel</w:t>
+            </w:r>
+          </w:p>
+        </w:tc>
+        <w:tc>
+          <w:tcPr>
+            <w:tcW w:type="dxa" w:w="4320"/>
+          </w:tcPr>
+          <w:p>
+            <w:r/>
+          </w:p>
+        </w:tc>
+      </w:tr>
+      <w:tr>
+        <w:tc>
+          <w:tcPr>
+            <w:tcW w:type="dxa" w:w="4320"/>
+          </w:tcPr>
+          <w:p>
+            <w:r>
               <w:t>Intro/Einleitung (optional)</w:t>
             </w:r>
           </w:p>
@@ -892,6 +972,26 @@
             <w:r>
               <w:t>A-005</w:t>
             </w:r>
+          </w:p>
+        </w:tc>
+      </w:tr>
+      <w:tr>
+        <w:tc>
+          <w:tcPr>
+            <w:tcW w:type="dxa" w:w="4320"/>
+          </w:tcPr>
+          <w:p>
+            <w:r>
+              <w:t>Titel</w:t>
+            </w:r>
+          </w:p>
+        </w:tc>
+        <w:tc>
+          <w:tcPr>
+            <w:tcW w:type="dxa" w:w="4320"/>
+          </w:tcPr>
+          <w:p>
+            <w:r/>
           </w:p>
         </w:tc>
       </w:tr>

</xml_diff>